<commit_message>
Unify author info: Dechang Xu & Eileen Zhang (no affiliation)
- README: remove university affiliations
- Paper v80: fix Yu→Xu, remove affiliation line
- Cover letter: fix Yu→Xu, remove XJTLU affiliation
</commit_message>
<xml_diff>
--- a/docs/Cover_Letter_v64.docx
+++ b/docs/Cover_Letter_v64.docx
@@ -291,7 +291,7 @@
           <w:i w:val="0"/>
           <w:sz w:val="22"/>
         </w:rPr>
-        <w:t>Dechang Yu, Academy of AI, Xi'an Jiaotong-Liverpool University, dechang.yu@xjtlu.edu.cn (corresponding author)</w:t>
+        <w:t>dechang.xu@outlook.com</w:t>
       </w:r>
     </w:p>
     <w:p>
@@ -301,7 +301,6 @@
           <w:i w:val="0"/>
           <w:sz w:val="22"/>
         </w:rPr>
-        <w:t>Eileen Zhang, Academy of AI, Xi'an Jiaotong-Liverpool University, eileen.zhang@xjtlu.edu.cn</w:t>
       </w:r>
     </w:p>
     <w:p>
@@ -387,7 +386,7 @@
           <w:i w:val="0"/>
           <w:sz w:val="22"/>
         </w:rPr>
-        <w:t>Dechang Yu</w:t>
+        <w:t>Dechang Xu</w:t>
       </w:r>
     </w:p>
     <w:p>
@@ -407,7 +406,6 @@
           <w:i w:val="0"/>
           <w:sz w:val="22"/>
         </w:rPr>
-        <w:t>Academy of AI, Xi'an Jiaotong-Liverpool University, Suzhou, China</w:t>
       </w:r>
     </w:p>
     <w:sectPr>

</xml_diff>